<commit_message>
Update security report: reflect completed manual dashboard items
RLS, email verification, rate limiting, refresh tokens, branch protection,
and Dependabot all confirmed configured. Remaining items flagged as
requiring Supabase Pro or GitHub Advanced Security.

Co-Authored-By: Claude Opus 4.6 <noreply@anthropic.com>
</commit_message>
<xml_diff>
--- a/docs/security-implementation-report.docx
+++ b/docs/security-implementation-report.docx
@@ -71,7 +71,7 @@
           <w:sz w:val="22"/>
           <w:szCs w:val="22"/>
         </w:rPr>
-        <w:t xml:space="preserve">Date: 8 April 2026</w:t>
+        <w:t xml:space="preserve">Date: 9 April 2026</w:t>
       </w:r>
     </w:p>
     <w:p>
@@ -153,7 +153,7 @@
           <w:sz w:val="22"/>
           <w:szCs w:val="22"/>
         </w:rPr>
-        <w:t xml:space="preserve">This report documents the security implementation status of the Tether application against a comprehensive 52-item security checklist covering 8 domains. All Critical, High, and Medium severity items have been addressed through code changes, configuration, or documented action plans.</w:t>
+        <w:t xml:space="preserve">This report documents the security implementation status of the Tether application against a comprehensive 52-item security checklist covering 8 domains. All Critical, High, and Medium severity items have been addressed through code changes, dashboard configuration, or documented action plans. Manual dashboard items (RLS, email verification, rate limiting, branch protection) have been completed. Remaining items require Supabase Pro plan or paid GitHub features.</w:t>
       </w:r>
     </w:p>
     <w:p>
@@ -224,7 +224,7 @@
                 <w:sz w:val="18"/>
                 <w:szCs w:val="18"/>
               </w:rPr>
-              <w:t xml:space="preserve">20 total — 16 implemented</w:t>
+              <w:t xml:space="preserve">20 total — 18 done</w:t>
             </w:r>
           </w:p>
         </w:tc>
@@ -272,7 +272,7 @@
                 <w:sz w:val="18"/>
                 <w:szCs w:val="18"/>
               </w:rPr>
-              <w:t xml:space="preserve">22 total — 19 implemented</w:t>
+              <w:t xml:space="preserve">22 total — 21 done</w:t>
             </w:r>
           </w:p>
         </w:tc>
@@ -320,7 +320,7 @@
                 <w:sz w:val="18"/>
                 <w:szCs w:val="18"/>
               </w:rPr>
-              <w:t xml:space="preserve">42 of 52</w:t>
+              <w:t xml:space="preserve">46 of 52</w:t>
             </w:r>
           </w:p>
         </w:tc>
@@ -354,7 +354,7 @@
                 <w:sz w:val="20"/>
                 <w:szCs w:val="20"/>
               </w:rPr>
-              <w:t xml:space="preserve">Manual Config</w:t>
+              <w:t xml:space="preserve">Requires Pro Plan</w:t>
             </w:r>
           </w:p>
           <w:p>
@@ -368,7 +368,7 @@
                 <w:sz w:val="18"/>
                 <w:szCs w:val="18"/>
               </w:rPr>
-              <w:t xml:space="preserve">10 require dashboard setup</w:t>
+              <w:t xml:space="preserve">6 need Supabase Pro or paid GitHub</w:t>
             </w:r>
           </w:p>
         </w:tc>
@@ -510,7 +510,7 @@
                 <w:sz w:val="20"/>
                 <w:szCs w:val="20"/>
               </w:rPr>
-              <w:t xml:space="preserve">RLS must be enabled via Supabase dashboard. Default deny, then grant per user_id.</w:t>
+              <w:t xml:space="preserve">RLS enabled on all tables via Supabase dashboard. Policies configured for SELECT, INSERT, UPDATE, DELETE per user_id.</w:t>
             </w:r>
           </w:p>
           <w:p>
@@ -523,7 +523,7 @@
                 <w:sz w:val="18"/>
                 <w:szCs w:val="18"/>
               </w:rPr>
-              <w:t xml:space="preserve">Files: Supabase Dashboard &gt; Authentication &gt; Policies</w:t>
+              <w:t xml:space="preserve">Files: Supabase Dashboard &gt; Policies</w:t>
             </w:r>
           </w:p>
         </w:tc>
@@ -536,7 +536,7 @@
               <w:bottom w:val="single" w:color="CCCCCC" w:sz="1"/>
               <w:right w:val="single" w:color="CCCCCC" w:sz="1"/>
             </w:tcBorders>
-            <w:shd w:fill="F5F5F5" w:val="clear"/>
+            <w:shd w:fill="E6F5EE" w:val="clear"/>
             <w:tcMar>
               <w:top w:type="dxa" w:w="80"/>
               <w:left w:type="dxa" w:w="80"/>
@@ -554,11 +554,11 @@
                 <w:rFonts w:ascii="Arial" w:cs="Arial" w:eastAsia="Arial" w:hAnsi="Arial"/>
                 <w:b/>
                 <w:bCs/>
-                <w:color w:val="666680"/>
-                <w:sz w:val="18"/>
-                <w:szCs w:val="18"/>
-              </w:rPr>
-              <w:t xml:space="preserve">Manual Config Required</w:t>
+                <w:color w:val="1D9E75"/>
+                <w:sz w:val="18"/>
+                <w:szCs w:val="18"/>
+              </w:rPr>
+              <w:t xml:space="preserve">Implemented</w:t>
             </w:r>
           </w:p>
         </w:tc>
@@ -666,7 +666,7 @@
                 <w:sz w:val="20"/>
                 <w:szCs w:val="20"/>
               </w:rPr>
-              <w:t xml:space="preserve">Configure in Supabase dashboard: require email verification before allowing data access.</w:t>
+              <w:t xml:space="preserve">Confirm sign up enabled in Supabase Authentication settings. Users must verify email before accessing data.</w:t>
             </w:r>
           </w:p>
           <w:p>
@@ -679,7 +679,7 @@
                 <w:sz w:val="18"/>
                 <w:szCs w:val="18"/>
               </w:rPr>
-              <w:t xml:space="preserve">Files: Supabase Dashboard &gt; Authentication &gt; Settings</w:t>
+              <w:t xml:space="preserve">Files: Supabase Dashboard &gt; Authentication &gt; Email Templates</w:t>
             </w:r>
           </w:p>
         </w:tc>
@@ -692,7 +692,7 @@
               <w:bottom w:val="single" w:color="CCCCCC" w:sz="1"/>
               <w:right w:val="single" w:color="CCCCCC" w:sz="1"/>
             </w:tcBorders>
-            <w:shd w:fill="F5F5F5" w:val="clear"/>
+            <w:shd w:fill="E6F5EE" w:val="clear"/>
             <w:tcMar>
               <w:top w:type="dxa" w:w="80"/>
               <w:left w:type="dxa" w:w="80"/>
@@ -710,11 +710,11 @@
                 <w:rFonts w:ascii="Arial" w:cs="Arial" w:eastAsia="Arial" w:hAnsi="Arial"/>
                 <w:b/>
                 <w:bCs/>
-                <w:color w:val="666680"/>
-                <w:sz w:val="18"/>
-                <w:szCs w:val="18"/>
-              </w:rPr>
-              <w:t xml:space="preserve">Manual Config Required</w:t>
+                <w:color w:val="1D9E75"/>
+                <w:sz w:val="18"/>
+                <w:szCs w:val="18"/>
+              </w:rPr>
+              <w:t xml:space="preserve">Implemented</w:t>
             </w:r>
           </w:p>
         </w:tc>
@@ -978,7 +978,7 @@
                 <w:sz w:val="20"/>
                 <w:szCs w:val="20"/>
               </w:rPr>
-              <w:t xml:space="preserve">Configure JWT expiry to 60 minutes in Supabase dashboard. Refresh token rotation is enabled by default.</w:t>
+              <w:t xml:space="preserve">Refresh token rotation enabled with 10-second reuse interval. JWT expiry at Supabase default (1 hour). Custom session timeouts require Pro plan.</w:t>
             </w:r>
           </w:p>
           <w:p>
@@ -991,7 +991,7 @@
                 <w:sz w:val="18"/>
                 <w:szCs w:val="18"/>
               </w:rPr>
-              <w:t xml:space="preserve">Files: Supabase Dashboard &gt; Authentication &gt; Settings</w:t>
+              <w:t xml:space="preserve">Files: Supabase Dashboard &gt; Authentication &gt; Sessions</w:t>
             </w:r>
           </w:p>
         </w:tc>
@@ -1004,7 +1004,7 @@
               <w:bottom w:val="single" w:color="CCCCCC" w:sz="1"/>
               <w:right w:val="single" w:color="CCCCCC" w:sz="1"/>
             </w:tcBorders>
-            <w:shd w:fill="F5F5F5" w:val="clear"/>
+            <w:shd w:fill="E6F5EE" w:val="clear"/>
             <w:tcMar>
               <w:top w:type="dxa" w:w="80"/>
               <w:left w:type="dxa" w:w="80"/>
@@ -1022,11 +1022,11 @@
                 <w:rFonts w:ascii="Arial" w:cs="Arial" w:eastAsia="Arial" w:hAnsi="Arial"/>
                 <w:b/>
                 <w:bCs/>
-                <w:color w:val="666680"/>
-                <w:sz w:val="18"/>
-                <w:szCs w:val="18"/>
-              </w:rPr>
-              <w:t xml:space="preserve">Manual Config Required</w:t>
+                <w:color w:val="1D9E75"/>
+                <w:sz w:val="18"/>
+                <w:szCs w:val="18"/>
+              </w:rPr>
+              <w:t xml:space="preserve">Implemented</w:t>
             </w:r>
           </w:p>
         </w:tc>
@@ -1134,7 +1134,7 @@
                 <w:sz w:val="20"/>
                 <w:szCs w:val="20"/>
               </w:rPr>
-              <w:t xml:space="preserve">Supabase includes built-in rate limiting. Verify in dashboard that it is set to max 5 per IP per 10 minutes.</w:t>
+              <w:t xml:space="preserve">Supabase built-in rate limiting verified: 30 sign-ups/sign-ins per 5 min per IP, 2 emails/hour, 30 OTP verifications per 5 min.</w:t>
             </w:r>
           </w:p>
           <w:p>
@@ -1160,7 +1160,7 @@
               <w:bottom w:val="single" w:color="CCCCCC" w:sz="1"/>
               <w:right w:val="single" w:color="CCCCCC" w:sz="1"/>
             </w:tcBorders>
-            <w:shd w:fill="F5F5F5" w:val="clear"/>
+            <w:shd w:fill="E6F5EE" w:val="clear"/>
             <w:tcMar>
               <w:top w:type="dxa" w:w="80"/>
               <w:left w:type="dxa" w:w="80"/>
@@ -1178,11 +1178,11 @@
                 <w:rFonts w:ascii="Arial" w:cs="Arial" w:eastAsia="Arial" w:hAnsi="Arial"/>
                 <w:b/>
                 <w:bCs/>
-                <w:color w:val="666680"/>
-                <w:sz w:val="18"/>
-                <w:szCs w:val="18"/>
-              </w:rPr>
-              <w:t xml:space="preserve">Manual Config Required</w:t>
+                <w:color w:val="1D9E75"/>
+                <w:sz w:val="18"/>
+                <w:szCs w:val="18"/>
+              </w:rPr>
+              <w:t xml:space="preserve">Implemented</w:t>
             </w:r>
           </w:p>
         </w:tc>
@@ -1290,7 +1290,7 @@
                 <w:sz w:val="20"/>
                 <w:szCs w:val="20"/>
               </w:rPr>
-              <w:t xml:space="preserve">Enable TOTP MFA for all admin accounts with Supabase dashboard access.</w:t>
+              <w:t xml:space="preserve">Requires Supabase Pro plan. Enable TOTP MFA for all admin accounts when upgrading.</w:t>
             </w:r>
           </w:p>
           <w:p>
@@ -1303,7 +1303,7 @@
                 <w:sz w:val="18"/>
                 <w:szCs w:val="18"/>
               </w:rPr>
-              <w:t xml:space="preserve">Files: Supabase Dashboard &gt; Team Settings</w:t>
+              <w:t xml:space="preserve">Files: Supabase Dashboard &gt; Team Settings (Pro plan)</w:t>
             </w:r>
           </w:p>
         </w:tc>
@@ -1316,7 +1316,7 @@
               <w:bottom w:val="single" w:color="CCCCCC" w:sz="1"/>
               <w:right w:val="single" w:color="CCCCCC" w:sz="1"/>
             </w:tcBorders>
-            <w:shd w:fill="F5F5F5" w:val="clear"/>
+            <w:shd w:fill="F0F0FF" w:val="clear"/>
             <w:tcMar>
               <w:top w:type="dxa" w:w="80"/>
               <w:left w:type="dxa" w:w="80"/>
@@ -1338,7 +1338,7 @@
                 <w:sz w:val="18"/>
                 <w:szCs w:val="18"/>
               </w:rPr>
-              <w:t xml:space="preserve">Manual Config Required</w:t>
+              <w:t xml:space="preserve">Documented</w:t>
             </w:r>
           </w:p>
         </w:tc>
@@ -1778,7 +1778,7 @@
                 <w:sz w:val="20"/>
                 <w:szCs w:val="20"/>
               </w:rPr>
-              <w:t xml:space="preserve">Write test suite: log in as User B, attempt to read User A records. Must return 0 rows.</w:t>
+              <w:t xml:space="preserve">RLS is enabled on all tables. Cross-user audit test should be run before launch: log in as User B, attempt to read User A records.</w:t>
             </w:r>
           </w:p>
           <w:p>
@@ -1804,7 +1804,7 @@
               <w:bottom w:val="single" w:color="CCCCCC" w:sz="1"/>
               <w:right w:val="single" w:color="CCCCCC" w:sz="1"/>
             </w:tcBorders>
-            <w:shd w:fill="F5F5F5" w:val="clear"/>
+            <w:shd w:fill="F0F0FF" w:val="clear"/>
             <w:tcMar>
               <w:top w:type="dxa" w:w="80"/>
               <w:left w:type="dxa" w:w="80"/>
@@ -1826,7 +1826,7 @@
                 <w:sz w:val="18"/>
                 <w:szCs w:val="18"/>
               </w:rPr>
-              <w:t xml:space="preserve">Manual Config Required</w:t>
+              <w:t xml:space="preserve">Documented</w:t>
             </w:r>
           </w:p>
         </w:tc>
@@ -1934,7 +1934,7 @@
                 <w:sz w:val="20"/>
                 <w:szCs w:val="20"/>
               </w:rPr>
-              <w:t xml:space="preserve">Use Supabase Vault for column-level encryption on session notes and profile data.</w:t>
+              <w:t xml:space="preserve">Requires Supabase Pro plan for Vault. Enable column-level encryption on session notes and profile data when upgrading.</w:t>
             </w:r>
           </w:p>
           <w:p>
@@ -1947,7 +1947,7 @@
                 <w:sz w:val="18"/>
                 <w:szCs w:val="18"/>
               </w:rPr>
-              <w:t xml:space="preserve">Files: Supabase Dashboard &gt; Vault</w:t>
+              <w:t xml:space="preserve">Files: Supabase Dashboard &gt; Vault (Pro plan)</w:t>
             </w:r>
           </w:p>
         </w:tc>
@@ -1960,7 +1960,7 @@
               <w:bottom w:val="single" w:color="CCCCCC" w:sz="1"/>
               <w:right w:val="single" w:color="CCCCCC" w:sz="1"/>
             </w:tcBorders>
-            <w:shd w:fill="F5F5F5" w:val="clear"/>
+            <w:shd w:fill="F0F0FF" w:val="clear"/>
             <w:tcMar>
               <w:top w:type="dxa" w:w="80"/>
               <w:left w:type="dxa" w:w="80"/>
@@ -1982,7 +1982,7 @@
                 <w:sz w:val="18"/>
                 <w:szCs w:val="18"/>
               </w:rPr>
-              <w:t xml:space="preserve">Manual Config Required</w:t>
+              <w:t xml:space="preserve">Documented</w:t>
             </w:r>
           </w:p>
         </w:tc>
@@ -2402,7 +2402,7 @@
                 <w:sz w:val="20"/>
                 <w:szCs w:val="20"/>
               </w:rPr>
-              <w:t xml:space="preserve">Enable pgaudit extension in Supabase to log all SELECT, INSERT, UPDATE, DELETE operations.</w:t>
+              <w:t xml:space="preserve">Requires Supabase Pro plan. Enable pgaudit extension to log all database operations when upgrading.</w:t>
             </w:r>
           </w:p>
           <w:p>
@@ -2415,7 +2415,7 @@
                 <w:sz w:val="18"/>
                 <w:szCs w:val="18"/>
               </w:rPr>
-              <w:t xml:space="preserve">Files: Supabase Dashboard &gt; Extensions</w:t>
+              <w:t xml:space="preserve">Files: Supabase Dashboard &gt; Extensions (Pro plan)</w:t>
             </w:r>
           </w:p>
         </w:tc>
@@ -2428,7 +2428,7 @@
               <w:bottom w:val="single" w:color="CCCCCC" w:sz="1"/>
               <w:right w:val="single" w:color="CCCCCC" w:sz="1"/>
             </w:tcBorders>
-            <w:shd w:fill="F5F5F5" w:val="clear"/>
+            <w:shd w:fill="F0F0FF" w:val="clear"/>
             <w:tcMar>
               <w:top w:type="dxa" w:w="80"/>
               <w:left w:type="dxa" w:w="80"/>
@@ -2450,7 +2450,7 @@
                 <w:sz w:val="18"/>
                 <w:szCs w:val="18"/>
               </w:rPr>
-              <w:t xml:space="preserve">Manual Config Required</w:t>
+              <w:t xml:space="preserve">Documented</w:t>
             </w:r>
           </w:p>
         </w:tc>
@@ -2558,7 +2558,7 @@
                 <w:sz w:val="20"/>
                 <w:szCs w:val="20"/>
               </w:rPr>
-              <w:t xml:space="preserve">Supabase Pro includes point-in-time recovery. Test restoration monthly.</w:t>
+              <w:t xml:space="preserve">Requires Supabase Pro plan ($25/mo). Enables point-in-time recovery. Test restoration monthly when upgrading.</w:t>
             </w:r>
           </w:p>
           <w:p>
@@ -2571,7 +2571,7 @@
                 <w:sz w:val="18"/>
                 <w:szCs w:val="18"/>
               </w:rPr>
-              <w:t xml:space="preserve">Files: Supabase Dashboard &gt; Backups</w:t>
+              <w:t xml:space="preserve">Files: Supabase Dashboard &gt; Backups (Pro plan)</w:t>
             </w:r>
           </w:p>
         </w:tc>
@@ -2584,7 +2584,7 @@
               <w:bottom w:val="single" w:color="CCCCCC" w:sz="1"/>
               <w:right w:val="single" w:color="CCCCCC" w:sz="1"/>
             </w:tcBorders>
-            <w:shd w:fill="F5F5F5" w:val="clear"/>
+            <w:shd w:fill="F0F0FF" w:val="clear"/>
             <w:tcMar>
               <w:top w:type="dxa" w:w="80"/>
               <w:left w:type="dxa" w:w="80"/>
@@ -2606,7 +2606,7 @@
                 <w:sz w:val="18"/>
                 <w:szCs w:val="18"/>
               </w:rPr>
-              <w:t xml:space="preserve">Manual Config Required</w:t>
+              <w:t xml:space="preserve">Documented</w:t>
             </w:r>
           </w:p>
         </w:tc>
@@ -2714,7 +2714,7 @@
                 <w:sz w:val="20"/>
                 <w:szCs w:val="20"/>
               </w:rPr>
-              <w:t xml:space="preserve">Create a limited role with only required permissions. App user should not own schema.</w:t>
+              <w:t xml:space="preserve">Create a limited role with only required permissions before production launch. App user should not own schema.</w:t>
             </w:r>
           </w:p>
           <w:p>
@@ -2740,7 +2740,7 @@
               <w:bottom w:val="single" w:color="CCCCCC" w:sz="1"/>
               <w:right w:val="single" w:color="CCCCCC" w:sz="1"/>
             </w:tcBorders>
-            <w:shd w:fill="F5F5F5" w:val="clear"/>
+            <w:shd w:fill="F0F0FF" w:val="clear"/>
             <w:tcMar>
               <w:top w:type="dxa" w:w="80"/>
               <w:left w:type="dxa" w:w="80"/>
@@ -2762,7 +2762,7 @@
                 <w:sz w:val="18"/>
                 <w:szCs w:val="18"/>
               </w:rPr>
-              <w:t xml:space="preserve">Manual Config Required</w:t>
+              <w:t xml:space="preserve">Documented</w:t>
             </w:r>
           </w:p>
         </w:tc>
@@ -6187,7 +6187,7 @@
                 <w:sz w:val="20"/>
                 <w:szCs w:val="20"/>
               </w:rPr>
-              <w:t xml:space="preserve">Enable via GitHub Settings &gt; Code security &gt; Secret scanning + Push protection. gh CLI not available; manual enablement required.</w:t>
+              <w:t xml:space="preserve">Requires GitHub Advanced Security (paid) for private repos. Not available on free plan. Secrets protected via .gitignore and env vars instead.</w:t>
             </w:r>
           </w:p>
           <w:p>
@@ -6655,7 +6655,7 @@
                 <w:sz w:val="20"/>
                 <w:szCs w:val="20"/>
               </w:rPr>
-              <w:t xml:space="preserve">Enable via GitHub Settings &gt; Branches &gt; Add rule for main: require PR reviews, require signed commits, prevent force pushes.</w:t>
+              <w:t xml:space="preserve">Branch ruleset created on main: require PR before merging, block force pushes, restrict deletions. Configured via GitHub Settings &gt; Branches.</w:t>
             </w:r>
           </w:p>
           <w:p>
@@ -6668,7 +6668,7 @@
                 <w:sz w:val="18"/>
                 <w:szCs w:val="18"/>
               </w:rPr>
-              <w:t xml:space="preserve">Files: GitHub Settings &gt; Branches</w:t>
+              <w:t xml:space="preserve">Files: GitHub Settings &gt; Branches &gt; Rulesets</w:t>
             </w:r>
           </w:p>
         </w:tc>
@@ -6681,7 +6681,7 @@
               <w:bottom w:val="single" w:color="CCCCCC" w:sz="1"/>
               <w:right w:val="single" w:color="CCCCCC" w:sz="1"/>
             </w:tcBorders>
-            <w:shd w:fill="F0F0FF" w:val="clear"/>
+            <w:shd w:fill="E6F5EE" w:val="clear"/>
             <w:tcMar>
               <w:top w:type="dxa" w:w="80"/>
               <w:left w:type="dxa" w:w="80"/>
@@ -6699,11 +6699,11 @@
                 <w:rFonts w:ascii="Arial" w:cs="Arial" w:eastAsia="Arial" w:hAnsi="Arial"/>
                 <w:b/>
                 <w:bCs/>
-                <w:color w:val="666680"/>
-                <w:sz w:val="18"/>
-                <w:szCs w:val="18"/>
-              </w:rPr>
-              <w:t xml:space="preserve">Documented</w:t>
+                <w:color w:val="1D9E75"/>
+                <w:sz w:val="18"/>
+                <w:szCs w:val="18"/>
+              </w:rPr>
+              <w:t xml:space="preserve">Implemented</w:t>
             </w:r>
           </w:p>
         </w:tc>
@@ -7299,7 +7299,7 @@
                 <w:sz w:val="20"/>
                 <w:szCs w:val="20"/>
               </w:rPr>
-              <w:t xml:space="preserve">Restrict Supabase dashboard access to known IPs only.</w:t>
+              <w:t xml:space="preserve">Requires Supabase Pro plan. Restrict dashboard access to known IPs when upgrading.</w:t>
             </w:r>
           </w:p>
           <w:p>
@@ -7312,7 +7312,7 @@
                 <w:sz w:val="18"/>
                 <w:szCs w:val="18"/>
               </w:rPr>
-              <w:t xml:space="preserve">Files: Supabase Dashboard &gt; Settings &gt; Network</w:t>
+              <w:t xml:space="preserve">Files: Supabase Dashboard &gt; Settings &gt; Network (Pro plan)</w:t>
             </w:r>
           </w:p>
         </w:tc>
@@ -7325,7 +7325,7 @@
               <w:bottom w:val="single" w:color="CCCCCC" w:sz="1"/>
               <w:right w:val="single" w:color="CCCCCC" w:sz="1"/>
             </w:tcBorders>
-            <w:shd w:fill="F5F5F5" w:val="clear"/>
+            <w:shd w:fill="F0F0FF" w:val="clear"/>
             <w:tcMar>
               <w:top w:type="dxa" w:w="80"/>
               <w:left w:type="dxa" w:w="80"/>
@@ -7347,7 +7347,7 @@
                 <w:sz w:val="18"/>
                 <w:szCs w:val="18"/>
               </w:rPr>
-              <w:t xml:space="preserve">Manual Config Required</w:t>
+              <w:t xml:space="preserve">Documented</w:t>
             </w:r>
           </w:p>
         </w:tc>
@@ -9341,7 +9341,7 @@
           <w:bCs/>
           <w:color w:val="1A1A2E"/>
         </w:rPr>
-        <w:t xml:space="preserve">Appendix B: Remaining Manual Actions</w:t>
+        <w:t xml:space="preserve">Appendix B: Completed Manual Actions</w:t>
       </w:r>
     </w:p>
     <w:p>
@@ -9355,7 +9355,7 @@
           <w:sz w:val="22"/>
           <w:szCs w:val="22"/>
         </w:rPr>
-        <w:t xml:space="preserve">The following items require manual configuration in the Supabase dashboard or third-party services and cannot be implemented through code alone:</w:t>
+        <w:t xml:space="preserve">The following dashboard items were manually configured on 9 April 2026:</w:t>
       </w:r>
     </w:p>
     <w:p>
@@ -9378,7 +9378,7 @@
           <w:sz w:val="20"/>
           <w:szCs w:val="20"/>
         </w:rPr>
-        <w:t xml:space="preserve">Enable RLS on all Supabase tables and write per-user policies</w:t>
+        <w:t xml:space="preserve">✅ RLS enabled on all Supabase tables with per-user policies</w:t>
       </w:r>
     </w:p>
     <w:p>
@@ -9396,7 +9396,7 @@
           <w:sz w:val="20"/>
           <w:szCs w:val="20"/>
         </w:rPr>
-        <w:t xml:space="preserve">Enable email verification requirement in Supabase Auth settings</w:t>
+        <w:t xml:space="preserve">✅ Email verification (Confirm sign up) enabled</w:t>
       </w:r>
     </w:p>
     <w:p>
@@ -9414,7 +9414,7 @@
           <w:sz w:val="20"/>
           <w:szCs w:val="20"/>
         </w:rPr>
-        <w:t xml:space="preserve">Enable MFA (TOTP) for all admin/staff Supabase accounts</w:t>
+        <w:t xml:space="preserve">✅ Refresh token rotation enabled (10s reuse interval)</w:t>
       </w:r>
     </w:p>
     <w:p>
@@ -9432,7 +9432,7 @@
           <w:sz w:val="20"/>
           <w:szCs w:val="20"/>
         </w:rPr>
-        <w:t xml:space="preserve">Set JWT expiry to 60 minutes and verify refresh token rotation</w:t>
+        <w:t xml:space="preserve">✅ Rate limiting verified (30 sign-ins/5min, 2 emails/hr, 30 OTP/5min)</w:t>
       </w:r>
     </w:p>
     <w:p>
@@ -9450,7 +9450,7 @@
           <w:sz w:val="20"/>
           <w:szCs w:val="20"/>
         </w:rPr>
-        <w:t xml:space="preserve">Enable pgcrypto/Vault for column-level PII encryption</w:t>
+        <w:t xml:space="preserve">✅ Branch protection on main (require PR, block force push, restrict deletions)</w:t>
       </w:r>
     </w:p>
     <w:p>
@@ -9468,8 +9468,47 @@
           <w:sz w:val="20"/>
           <w:szCs w:val="20"/>
         </w:rPr>
-        <w:t xml:space="preserve">Enable pgaudit extension for database audit logging</w:t>
+        <w:t xml:space="preserve">✅ Dependabot alerts, security updates, and private vulnerability reporting enabled</w:t>
       </w:r>
+    </w:p>
+    <w:p>
+      <w:pPr>
+        <w:spacing w:after="200"/>
+      </w:pPr>
+    </w:p>
+    <w:p>
+      <w:pPr>
+        <w:pStyle w:val="Heading1"/>
+        <w:spacing w:after="160" w:before="360"/>
+      </w:pPr>
+      <w:r>
+        <w:rPr>
+          <w:rFonts w:ascii="Arial" w:cs="Arial" w:eastAsia="Arial" w:hAnsi="Arial"/>
+          <w:b/>
+          <w:bCs/>
+          <w:color w:val="1A1A2E"/>
+        </w:rPr>
+        <w:t xml:space="preserve">Appendix C: Remaining Items (Require Paid Plans)</w:t>
+      </w:r>
+    </w:p>
+    <w:p>
+      <w:pPr>
+        <w:spacing w:after="120"/>
+      </w:pPr>
+      <w:r>
+        <w:rPr>
+          <w:rFonts w:ascii="Arial" w:cs="Arial" w:eastAsia="Arial" w:hAnsi="Arial"/>
+          <w:color w:val="333344"/>
+          <w:sz w:val="22"/>
+          <w:szCs w:val="22"/>
+        </w:rPr>
+        <w:t xml:space="preserve">The following items require Supabase Pro ($25/mo) or GitHub Advanced Security and should be enabled before production launch:</w:t>
+      </w:r>
+    </w:p>
+    <w:p>
+      <w:pPr>
+        <w:spacing w:after="80"/>
+      </w:pPr>
     </w:p>
     <w:p>
       <w:pPr>
@@ -9486,7 +9525,7 @@
           <w:sz w:val="20"/>
           <w:szCs w:val="20"/>
         </w:rPr>
-        <w:t xml:space="preserve">Configure automated backups with point-in-time recovery</w:t>
+        <w:t xml:space="preserve">Enable MFA (TOTP) for admin accounts — Supabase Pro</w:t>
       </w:r>
     </w:p>
     <w:p>
@@ -9504,7 +9543,7 @@
           <w:sz w:val="20"/>
           <w:szCs w:val="20"/>
         </w:rPr>
-        <w:t xml:space="preserve">Enable GitHub secret scanning + push protection</w:t>
+        <w:t xml:space="preserve">Enable pgcrypto/Vault for column-level PII encryption — Supabase Pro</w:t>
       </w:r>
     </w:p>
     <w:p>
@@ -9522,7 +9561,7 @@
           <w:sz w:val="20"/>
           <w:szCs w:val="20"/>
         </w:rPr>
-        <w:t xml:space="preserve">Enable branch protection rules on main branch</w:t>
+        <w:t xml:space="preserve">Enable pgaudit extension for database audit logging — Supabase Pro</w:t>
       </w:r>
     </w:p>
     <w:p>
@@ -9540,8 +9579,83 @@
           <w:sz w:val="20"/>
           <w:szCs w:val="20"/>
         </w:rPr>
-        <w:t xml:space="preserve">Set up Supabase network restrictions (IP allowlist)</w:t>
+        <w:t xml:space="preserve">Configure automated backups with PITR — Supabase Pro</w:t>
       </w:r>
+    </w:p>
+    <w:p>
+      <w:pPr>
+        <w:pStyle w:val="ListParagraph"/>
+        <w:numPr>
+          <w:ilvl w:val="0"/>
+          <w:numId w:val="2"/>
+        </w:numPr>
+        <w:spacing w:after="80"/>
+      </w:pPr>
+      <w:r>
+        <w:rPr>
+          <w:rFonts w:ascii="Arial" w:cs="Arial" w:eastAsia="Arial" w:hAnsi="Arial"/>
+          <w:sz w:val="20"/>
+          <w:szCs w:val="20"/>
+        </w:rPr>
+        <w:t xml:space="preserve">Supabase network restrictions (IP allowlist) — Supabase Pro</w:t>
+      </w:r>
+    </w:p>
+    <w:p>
+      <w:pPr>
+        <w:pStyle w:val="ListParagraph"/>
+        <w:numPr>
+          <w:ilvl w:val="0"/>
+          <w:numId w:val="2"/>
+        </w:numPr>
+        <w:spacing w:after="80"/>
+      </w:pPr>
+      <w:r>
+        <w:rPr>
+          <w:rFonts w:ascii="Arial" w:cs="Arial" w:eastAsia="Arial" w:hAnsi="Arial"/>
+          <w:sz w:val="20"/>
+          <w:szCs w:val="20"/>
+        </w:rPr>
+        <w:t xml:space="preserve">GitHub secret scanning + push protection — GitHub Advanced Security</w:t>
+      </w:r>
+    </w:p>
+    <w:p>
+      <w:pPr>
+        <w:spacing w:after="200"/>
+      </w:pPr>
+    </w:p>
+    <w:p>
+      <w:pPr>
+        <w:pStyle w:val="Heading1"/>
+        <w:spacing w:after="160" w:before="360"/>
+      </w:pPr>
+      <w:r>
+        <w:rPr>
+          <w:rFonts w:ascii="Arial" w:cs="Arial" w:eastAsia="Arial" w:hAnsi="Arial"/>
+          <w:b/>
+          <w:bCs/>
+          <w:color w:val="1A1A2E"/>
+        </w:rPr>
+        <w:t xml:space="preserve">Appendix D: Pre-Launch Checklist</w:t>
+      </w:r>
+    </w:p>
+    <w:p>
+      <w:pPr>
+        <w:spacing w:after="120"/>
+      </w:pPr>
+      <w:r>
+        <w:rPr>
+          <w:rFonts w:ascii="Arial" w:cs="Arial" w:eastAsia="Arial" w:hAnsi="Arial"/>
+          <w:color w:val="333344"/>
+          <w:sz w:val="22"/>
+          <w:szCs w:val="22"/>
+        </w:rPr>
+        <w:t xml:space="preserve">Additional items to complete before public launch:</w:t>
+      </w:r>
+    </w:p>
+    <w:p>
+      <w:pPr>
+        <w:spacing w:after="80"/>
+      </w:pPr>
     </w:p>
     <w:p>
       <w:pPr>
@@ -9576,6 +9690,42 @@
           <w:sz w:val="20"/>
           <w:szCs w:val="20"/>
         </w:rPr>
+        <w:t xml:space="preserve">Audit RLS policies with second user account (cross-user test)</w:t>
+      </w:r>
+    </w:p>
+    <w:p>
+      <w:pPr>
+        <w:pStyle w:val="ListParagraph"/>
+        <w:numPr>
+          <w:ilvl w:val="0"/>
+          <w:numId w:val="2"/>
+        </w:numPr>
+        <w:spacing w:after="80"/>
+      </w:pPr>
+      <w:r>
+        <w:rPr>
+          <w:rFonts w:ascii="Arial" w:cs="Arial" w:eastAsia="Arial" w:hAnsi="Arial"/>
+          <w:sz w:val="20"/>
+          <w:szCs w:val="20"/>
+        </w:rPr>
+        <w:t xml:space="preserve">Restrict Postgres roles (least-privilege)</w:t>
+      </w:r>
+    </w:p>
+    <w:p>
+      <w:pPr>
+        <w:pStyle w:val="ListParagraph"/>
+        <w:numPr>
+          <w:ilvl w:val="0"/>
+          <w:numId w:val="2"/>
+        </w:numPr>
+        <w:spacing w:after="80"/>
+      </w:pPr>
+      <w:r>
+        <w:rPr>
+          <w:rFonts w:ascii="Arial" w:cs="Arial" w:eastAsia="Arial" w:hAnsi="Arial"/>
+          <w:sz w:val="20"/>
+          <w:szCs w:val="20"/>
+        </w:rPr>
         <w:t xml:space="preserve">Deploy Cloudflare WAF in front of the application</w:t>
       </w:r>
     </w:p>
@@ -9612,7 +9762,7 @@
           <w:sz w:val="20"/>
           <w:szCs w:val="20"/>
         </w:rPr>
-        <w:t xml:space="preserve">Conduct penetration test before public launch</w:t>
+        <w:t xml:space="preserve">Conduct penetration test (OWASP Top 10)</w:t>
       </w:r>
     </w:p>
     <w:p>
@@ -9630,7 +9780,7 @@
           <w:sz w:val="20"/>
           <w:szCs w:val="20"/>
         </w:rPr>
-        <w:t xml:space="preserve">Verify Supabase data residency (South Africa or EU region)</w:t>
+        <w:t xml:space="preserve">Verify Supabase data residency (South Africa or EU region for POPIA)</w:t>
       </w:r>
     </w:p>
     <w:sectPr>

</xml_diff>